<commit_message>
Ajoute le Katana Kumo (193 / 423)
Lame procédurale à nuages noirs et monture noir et or reconstruite en 3D,
convertie Sollumz, placée en main (vérifiée contre le Katana Noir), avec
ressource FiveM, icône et bloc ox_inventory. Registre et procédure à jour.

Co-Authored-By: Claude Opus 5.5 <noreply@anthropic.com>
Claude-Session: https://claude.ai/code/session_011jSh7PHPKoso6Ww63oMJ3w
</commit_message>
<xml_diff>
--- a/1_PROCEDURE_Katana_Atsuo.docx
+++ b/1_PROCEDURE_Katana_Atsuo.docx
@@ -3880,6 +3880,101 @@
           </w:p>
         </w:tc>
       </w:tr>
+      <w:tr>
+        <w:trPr>
+          <w:tblHeader w:val="false"/>
+        </w:trPr>
+        <w:tc>
+          <w:tcPr>
+            <w:tcW w:type="dxa" w:w="2700"/>
+            <w:tcBorders>
+              <w:top w:val="single" w:color="BBBBBB" w:sz="4"/>
+              <w:left w:val="single" w:color="BBBBBB" w:sz="4"/>
+              <w:bottom w:val="single" w:color="BBBBBB" w:sz="4"/>
+              <w:right w:val="single" w:color="BBBBBB" w:sz="4"/>
+            </w:tcBorders>
+            <w:shd w:fill="FFFFFF" w:val="clear"/>
+            <w:tcMar>
+              <w:top w:type="dxa" w:w="60"/>
+              <w:left w:type="dxa" w:w="100"/>
+              <w:bottom w:type="dxa" w:w="60"/>
+              <w:right w:type="dxa" w:w="100"/>
+            </w:tcMar>
+          </w:tcPr>
+          <w:p>
+            <w:r>
+              <w:rPr>
+                <w:b w:val="false"/>
+                <w:bCs w:val="false"/>
+                <w:color w:val="1A1A1A"/>
+                <w:sz w:val="19"/>
+                <w:szCs w:val="19"/>
+              </w:rPr>
+              <w:t>atsuo_katana_kumo</w:t>
+            </w:r>
+          </w:p>
+        </w:tc>
+        <w:tc>
+          <w:tcPr>
+            <w:tcW w:type="dxa" w:w="2900"/>
+            <w:tcBorders>
+              <w:top w:val="single" w:color="BBBBBB" w:sz="4"/>
+              <w:left w:val="single" w:color="BBBBBB" w:sz="4"/>
+              <w:bottom w:val="single" w:color="BBBBBB" w:sz="4"/>
+              <w:right w:val="single" w:color="BBBBBB" w:sz="4"/>
+            </w:tcBorders>
+            <w:shd w:fill="FFFFFF" w:val="clear"/>
+            <w:tcMar>
+              <w:top w:type="dxa" w:w="60"/>
+              <w:left w:type="dxa" w:w="100"/>
+              <w:bottom w:type="dxa" w:w="60"/>
+              <w:right w:type="dxa" w:w="100"/>
+            </w:tcMar>
+          </w:tcPr>
+          <w:p>
+            <w:r>
+              <w:rPr>
+                <w:b w:val="false"/>
+                <w:bCs w:val="false"/>
+                <w:color w:val="1A1A1A"/>
+                <w:sz w:val="19"/>
+                <w:szCs w:val="19"/>
+              </w:rPr>
+              <w:t>WEAPON_KATANA_KUMO</w:t>
+            </w:r>
+          </w:p>
+        </w:tc>
+        <w:tc>
+          <w:tcPr>
+            <w:tcW w:type="dxa" w:w="3426"/>
+            <w:tcBorders>
+              <w:top w:val="single" w:color="BBBBBB" w:sz="4"/>
+              <w:left w:val="single" w:color="BBBBBB" w:sz="4"/>
+              <w:bottom w:val="single" w:color="BBBBBB" w:sz="4"/>
+              <w:right w:val="single" w:color="BBBBBB" w:sz="4"/>
+            </w:tcBorders>
+            <w:shd w:fill="FFFFFF" w:val="clear"/>
+            <w:tcMar>
+              <w:top w:type="dxa" w:w="60"/>
+              <w:left w:type="dxa" w:w="100"/>
+              <w:bottom w:type="dxa" w:w="60"/>
+              <w:right w:type="dxa" w:w="100"/>
+            </w:tcMar>
+          </w:tcPr>
+          <w:p>
+            <w:r>
+              <w:rPr>
+                <w:b w:val="false"/>
+                <w:bCs w:val="false"/>
+                <w:color w:val="1A1A1A"/>
+                <w:sz w:val="19"/>
+                <w:szCs w:val="19"/>
+              </w:rPr>
+              <w:t>193 / 423</w:t>
+            </w:r>
+          </w:p>
+        </w:tc>
+      </w:tr>
     </w:tbl>
     <w:p>
       <w:pPr>
@@ -3890,10 +3985,10 @@
           <w:b/>
           <w:bCs/>
         </w:rPr>
-        <w:t xml:space="preserve">Prochaine arme : 193 / 423</w:t>
-      </w:r>
-      <w:r>
-        <w:t xml:space="preserve"> (puis 194 / 424…). Chaque arme doit avoir des numéros uniques.</w:t>
+        <w:t>Prochaine arme : 194 / 424</w:t>
+      </w:r>
+      <w:r>
+        <w:t xml:space="preserve"> (puis 195 / 425…). Chaque arme doit avoir des numéros uniques.</w:t>
       </w:r>
     </w:p>
     <w:p>

</xml_diff>

<commit_message>
Ajoute le Katana Sakura (194 / 424)
Lame noire et rose haute résolution (8192x512) avec pétales et fleurs de
cerisier, hamon en vagues et lueur rose ; tsuba, habaki et monture à
fleurs de cerisier, tresse rose. Converti Sollumz, placé en main (vérifié
contre le Katana Noir), ressource FiveM, icône et bloc ox_inventory.

Co-Authored-By: Claude Opus 5.5 <noreply@anthropic.com>
Claude-Session: https://claude.ai/code/session_011jSh7PHPKoso6Ww63oMJ3w
</commit_message>
<xml_diff>
--- a/1_PROCEDURE_Katana_Atsuo.docx
+++ b/1_PROCEDURE_Katana_Atsuo.docx
@@ -3975,6 +3975,101 @@
           </w:p>
         </w:tc>
       </w:tr>
+      <w:tr>
+        <w:trPr>
+          <w:tblHeader w:val="false"/>
+        </w:trPr>
+        <w:tc>
+          <w:tcPr>
+            <w:tcW w:type="dxa" w:w="2700"/>
+            <w:tcBorders>
+              <w:top w:val="single" w:color="BBBBBB" w:sz="4"/>
+              <w:left w:val="single" w:color="BBBBBB" w:sz="4"/>
+              <w:bottom w:val="single" w:color="BBBBBB" w:sz="4"/>
+              <w:right w:val="single" w:color="BBBBBB" w:sz="4"/>
+            </w:tcBorders>
+            <w:shd w:fill="FFFFFF" w:val="clear"/>
+            <w:tcMar>
+              <w:top w:type="dxa" w:w="60"/>
+              <w:left w:type="dxa" w:w="100"/>
+              <w:bottom w:type="dxa" w:w="60"/>
+              <w:right w:type="dxa" w:w="100"/>
+            </w:tcMar>
+          </w:tcPr>
+          <w:p>
+            <w:r>
+              <w:rPr>
+                <w:b w:val="false"/>
+                <w:bCs w:val="false"/>
+                <w:color w:val="1A1A1A"/>
+                <w:sz w:val="19"/>
+                <w:szCs w:val="19"/>
+              </w:rPr>
+              <w:t>atsuo_katana_sakura</w:t>
+            </w:r>
+          </w:p>
+        </w:tc>
+        <w:tc>
+          <w:tcPr>
+            <w:tcW w:type="dxa" w:w="2900"/>
+            <w:tcBorders>
+              <w:top w:val="single" w:color="BBBBBB" w:sz="4"/>
+              <w:left w:val="single" w:color="BBBBBB" w:sz="4"/>
+              <w:bottom w:val="single" w:color="BBBBBB" w:sz="4"/>
+              <w:right w:val="single" w:color="BBBBBB" w:sz="4"/>
+            </w:tcBorders>
+            <w:shd w:fill="FFFFFF" w:val="clear"/>
+            <w:tcMar>
+              <w:top w:type="dxa" w:w="60"/>
+              <w:left w:type="dxa" w:w="100"/>
+              <w:bottom w:type="dxa" w:w="60"/>
+              <w:right w:type="dxa" w:w="100"/>
+            </w:tcMar>
+          </w:tcPr>
+          <w:p>
+            <w:r>
+              <w:rPr>
+                <w:b w:val="false"/>
+                <w:bCs w:val="false"/>
+                <w:color w:val="1A1A1A"/>
+                <w:sz w:val="19"/>
+                <w:szCs w:val="19"/>
+              </w:rPr>
+              <w:t>WEAPON_KATANA_SAKURA</w:t>
+            </w:r>
+          </w:p>
+        </w:tc>
+        <w:tc>
+          <w:tcPr>
+            <w:tcW w:type="dxa" w:w="3426"/>
+            <w:tcBorders>
+              <w:top w:val="single" w:color="BBBBBB" w:sz="4"/>
+              <w:left w:val="single" w:color="BBBBBB" w:sz="4"/>
+              <w:bottom w:val="single" w:color="BBBBBB" w:sz="4"/>
+              <w:right w:val="single" w:color="BBBBBB" w:sz="4"/>
+            </w:tcBorders>
+            <w:shd w:fill="FFFFFF" w:val="clear"/>
+            <w:tcMar>
+              <w:top w:type="dxa" w:w="60"/>
+              <w:left w:type="dxa" w:w="100"/>
+              <w:bottom w:type="dxa" w:w="60"/>
+              <w:right w:type="dxa" w:w="100"/>
+            </w:tcMar>
+          </w:tcPr>
+          <w:p>
+            <w:r>
+              <w:rPr>
+                <w:b w:val="false"/>
+                <w:bCs w:val="false"/>
+                <w:color w:val="1A1A1A"/>
+                <w:sz w:val="19"/>
+                <w:szCs w:val="19"/>
+              </w:rPr>
+              <w:t>194 / 424</w:t>
+            </w:r>
+          </w:p>
+        </w:tc>
+      </w:tr>
     </w:tbl>
     <w:p>
       <w:pPr>
@@ -3985,10 +4080,10 @@
           <w:b/>
           <w:bCs/>
         </w:rPr>
-        <w:t>Prochaine arme : 194 / 424</w:t>
-      </w:r>
-      <w:r>
-        <w:t xml:space="preserve"> (puis 195 / 425…). Chaque arme doit avoir des numéros uniques.</w:t>
+        <w:t>Prochaine arme : 195 / 425</w:t>
+      </w:r>
+      <w:r>
+        <w:t xml:space="preserve"> (puis 196 / 426…). Chaque arme doit avoir des numéros uniques.</w:t>
       </w:r>
     </w:p>
     <w:p>

</xml_diff>